<commit_message>
feature : add jpg diagram
</commit_message>
<xml_diff>
--- a/docs/V3.0/UML Diagrams/Diagrams explanation.docx
+++ b/docs/V3.0/UML Diagrams/Diagrams explanation.docx
@@ -2359,14 +2359,26 @@
         <w:rPr>
           <w:rStyle w:val="Aucun"/>
           <w:rFonts w:ascii="Arial" w:eastAsia="Arial" w:hAnsi="Arial" w:cs="Arial"/>
-        </w:rPr>
-      </w:pPr>
-      <w:r>
-        <w:rPr>
-          <w:rStyle w:val="Aucun"/>
-          <w:rFonts w:ascii="Arial" w:hAnsi="Arial"/>
-          <w:lang w:val="en-US"/>
-        </w:rPr>
+          <w:lang w:val="en-US"/>
+        </w:rPr>
+      </w:pPr>
+    </w:p>
+    <w:p>
+      <w:pPr>
+        <w:pStyle w:val="Corps"/>
+        <w:spacing w:line="240" w:lineRule="auto"/>
+        <w:rPr>
+          <w:rStyle w:val="Aucun"/>
+          <w:rFonts w:ascii="Arial" w:eastAsia="Arial" w:hAnsi="Arial" w:cs="Arial"/>
+        </w:rPr>
+      </w:pPr>
+      <w:r>
+        <w:rPr>
+          <w:rStyle w:val="Aucun"/>
+          <w:rFonts w:ascii="Arial" w:hAnsi="Arial"/>
+          <w:lang w:val="en-US"/>
+        </w:rPr>
+        <w:lastRenderedPageBreak/>
         <w:t>5. Loops and Conditions</w:t>
       </w:r>
     </w:p>
@@ -2389,7 +2401,6 @@
           <w:rFonts w:ascii="Arial" w:hAnsi="Arial"/>
           <w:lang w:val="en-US"/>
         </w:rPr>
-        <w:lastRenderedPageBreak/>
         <w:t>Loops show repeated actions, such as copying each file and each subfolder.</w:t>
       </w:r>
     </w:p>
@@ -2874,6 +2885,7 @@
           <w:bCs/>
           <w:sz w:val="36"/>
           <w:szCs w:val="36"/>
+          <w:lang w:val="en-GB"/>
         </w:rPr>
       </w:pPr>
       <w:r>
@@ -3440,6 +3452,28 @@
         <w:rPr>
           <w:rStyle w:val="Aucun"/>
           <w:rFonts w:ascii="Arial" w:eastAsia="Arial" w:hAnsi="Arial" w:cs="Arial"/>
+          <w:lang w:val="en-US"/>
+        </w:rPr>
+      </w:pPr>
+    </w:p>
+    <w:p>
+      <w:pPr>
+        <w:pStyle w:val="Corps"/>
+        <w:spacing w:line="240" w:lineRule="auto"/>
+        <w:rPr>
+          <w:rStyle w:val="Aucun"/>
+          <w:rFonts w:ascii="Arial" w:eastAsia="Arial" w:hAnsi="Arial" w:cs="Arial"/>
+          <w:lang w:val="en-US"/>
+        </w:rPr>
+      </w:pPr>
+    </w:p>
+    <w:p>
+      <w:pPr>
+        <w:pStyle w:val="Corps"/>
+        <w:spacing w:line="240" w:lineRule="auto"/>
+        <w:rPr>
+          <w:rStyle w:val="Aucun"/>
+          <w:rFonts w:ascii="Arial" w:eastAsia="Arial" w:hAnsi="Arial" w:cs="Arial"/>
           <w:lang w:val="en-GB"/>
         </w:rPr>
       </w:pPr>
@@ -3449,6 +3483,7 @@
           <w:rFonts w:ascii="Arial" w:hAnsi="Arial"/>
           <w:lang w:val="en-US"/>
         </w:rPr>
+        <w:lastRenderedPageBreak/>
         <w:t xml:space="preserve">A. </w:t>
       </w:r>
       <w:proofErr w:type="spellStart"/>
@@ -3501,7 +3536,6 @@
           <w:rFonts w:ascii="Arial" w:hAnsi="Arial"/>
           <w:lang w:val="en-US"/>
         </w:rPr>
-        <w:lastRenderedPageBreak/>
         <w:t>EasyLogService</w:t>
       </w:r>
       <w:proofErr w:type="spellEnd"/>
@@ -4150,6 +4184,7 @@
           <w:rFonts w:ascii="Arial" w:hAnsi="Arial"/>
           <w:lang w:val="en-US"/>
         </w:rPr>
+        <w:lastRenderedPageBreak/>
         <w:t>Views</w:t>
       </w:r>
       <w:r>
@@ -4216,7 +4251,6 @@
           <w:rFonts w:ascii="Arial" w:hAnsi="Arial"/>
           <w:lang w:val="en-GB"/>
         </w:rPr>
-        <w:lastRenderedPageBreak/>
         <w:t>Example :</w:t>
       </w:r>
       <w:proofErr w:type="gramEnd"/>
@@ -4807,6 +4841,104 @@
     <w:p>
       <w:pPr>
         <w:pStyle w:val="Corps"/>
+        <w:tabs>
+          <w:tab w:val="left" w:pos="720"/>
+        </w:tabs>
+        <w:spacing w:line="240" w:lineRule="auto"/>
+        <w:rPr>
+          <w:rStyle w:val="Aucun"/>
+          <w:rFonts w:ascii="Arial" w:eastAsia="Arial" w:hAnsi="Arial" w:cs="Arial"/>
+          <w:lang w:val="en-GB"/>
+        </w:rPr>
+      </w:pPr>
+    </w:p>
+    <w:p>
+      <w:pPr>
+        <w:pStyle w:val="Corps"/>
+        <w:tabs>
+          <w:tab w:val="left" w:pos="720"/>
+        </w:tabs>
+        <w:spacing w:line="240" w:lineRule="auto"/>
+        <w:rPr>
+          <w:rStyle w:val="Aucun"/>
+          <w:rFonts w:ascii="Arial" w:eastAsia="Arial" w:hAnsi="Arial" w:cs="Arial"/>
+          <w:lang w:val="en-GB"/>
+        </w:rPr>
+      </w:pPr>
+    </w:p>
+    <w:p>
+      <w:pPr>
+        <w:pStyle w:val="Corps"/>
+        <w:tabs>
+          <w:tab w:val="left" w:pos="720"/>
+        </w:tabs>
+        <w:spacing w:line="240" w:lineRule="auto"/>
+        <w:rPr>
+          <w:rStyle w:val="Aucun"/>
+          <w:rFonts w:ascii="Arial" w:eastAsia="Arial" w:hAnsi="Arial" w:cs="Arial"/>
+          <w:lang w:val="en-GB"/>
+        </w:rPr>
+      </w:pPr>
+    </w:p>
+    <w:p>
+      <w:pPr>
+        <w:pStyle w:val="Corps"/>
+        <w:tabs>
+          <w:tab w:val="left" w:pos="720"/>
+        </w:tabs>
+        <w:spacing w:line="240" w:lineRule="auto"/>
+        <w:rPr>
+          <w:rStyle w:val="Aucun"/>
+          <w:rFonts w:ascii="Arial" w:eastAsia="Arial" w:hAnsi="Arial" w:cs="Arial"/>
+          <w:lang w:val="en-GB"/>
+        </w:rPr>
+      </w:pPr>
+    </w:p>
+    <w:p>
+      <w:pPr>
+        <w:pStyle w:val="Corps"/>
+        <w:tabs>
+          <w:tab w:val="left" w:pos="720"/>
+        </w:tabs>
+        <w:spacing w:line="240" w:lineRule="auto"/>
+        <w:rPr>
+          <w:rStyle w:val="Aucun"/>
+          <w:rFonts w:ascii="Arial" w:eastAsia="Arial" w:hAnsi="Arial" w:cs="Arial"/>
+          <w:lang w:val="en-GB"/>
+        </w:rPr>
+      </w:pPr>
+    </w:p>
+    <w:p>
+      <w:pPr>
+        <w:pStyle w:val="Corps"/>
+        <w:tabs>
+          <w:tab w:val="left" w:pos="720"/>
+        </w:tabs>
+        <w:spacing w:line="240" w:lineRule="auto"/>
+        <w:rPr>
+          <w:rStyle w:val="Aucun"/>
+          <w:rFonts w:ascii="Arial" w:eastAsia="Arial" w:hAnsi="Arial" w:cs="Arial"/>
+          <w:lang w:val="en-GB"/>
+        </w:rPr>
+      </w:pPr>
+    </w:p>
+    <w:p>
+      <w:pPr>
+        <w:pStyle w:val="Corps"/>
+        <w:tabs>
+          <w:tab w:val="left" w:pos="720"/>
+        </w:tabs>
+        <w:spacing w:line="240" w:lineRule="auto"/>
+        <w:rPr>
+          <w:rStyle w:val="Aucun"/>
+          <w:rFonts w:ascii="Arial" w:eastAsia="Arial" w:hAnsi="Arial" w:cs="Arial"/>
+          <w:lang w:val="en-GB"/>
+        </w:rPr>
+      </w:pPr>
+    </w:p>
+    <w:p>
+      <w:pPr>
+        <w:pStyle w:val="Corps"/>
         <w:spacing w:line="240" w:lineRule="auto"/>
         <w:rPr>
           <w:rStyle w:val="Aucun"/>
@@ -4824,6 +4956,7 @@
           <w:szCs w:val="28"/>
           <w:lang w:val="en-US"/>
         </w:rPr>
+        <w:lastRenderedPageBreak/>
         <w:t>Relationships</w:t>
       </w:r>
     </w:p>
@@ -5007,7 +5140,6 @@
           <w:rFonts w:ascii="Arial" w:hAnsi="Arial"/>
           <w:lang w:val="en-US"/>
         </w:rPr>
-        <w:lastRenderedPageBreak/>
         <w:t xml:space="preserve">Impact: The rest of the application (like the </w:t>
       </w:r>
       <w:proofErr w:type="spellStart"/>
@@ -5603,6 +5735,7 @@
           <w:rFonts w:ascii="Arial" w:hAnsi="Arial"/>
           <w:lang w:val="en-US"/>
         </w:rPr>
+        <w:lastRenderedPageBreak/>
         <w:t>_menu: Found in interactions. It indicates the specific UI class the command is currently "driving."</w:t>
       </w:r>
     </w:p>
@@ -5829,7 +5962,6 @@
           <w:rFonts w:ascii="Arial" w:hAnsi="Arial"/>
           <w:lang w:val="en-US"/>
         </w:rPr>
-        <w:lastRenderedPageBreak/>
         <w:t>Impact: The controller creates or returns a DTO, but it doesn't "own" it as a permanent member.</w:t>
       </w:r>
     </w:p>

</xml_diff>